<commit_message>
update on 2026-01-28 21:16:01.326232
</commit_message>
<xml_diff>
--- a/cpp - system.docx
+++ b/cpp - system.docx
@@ -6422,6 +6422,12 @@
             <w:insideH w:val="single" w:color="auto" w:sz="4" w:space="0"/>
             <w:insideV w:val="single" w:color="auto" w:sz="4" w:space="0"/>
           </w:tblBorders>
+          <w:tblCellMar>
+            <w:top w:w="0" w:type="dxa"/>
+            <w:left w:w="108" w:type="dxa"/>
+            <w:bottom w:w="0" w:type="dxa"/>
+            <w:right w:w="108" w:type="dxa"/>
+          </w:tblCellMar>
         </w:tblPrEx>
         <w:tc>
           <w:tcPr>
@@ -10567,7 +10573,7 @@
           <w:rFonts w:hint="eastAsia"/>
           <w:lang w:val="en-US" w:eastAsia="zh-CN"/>
         </w:rPr>
-        <w:t>foxy：</w:t>
+        <w:t>ros2：</w:t>
       </w:r>
     </w:p>
     <w:p>
@@ -18471,12 +18477,6 @@
             <w:insideH w:val="single" w:color="auto" w:sz="4" w:space="0"/>
             <w:insideV w:val="single" w:color="auto" w:sz="4" w:space="0"/>
           </w:tblBorders>
-          <w:tblCellMar>
-            <w:top w:w="0" w:type="dxa"/>
-            <w:left w:w="108" w:type="dxa"/>
-            <w:bottom w:w="0" w:type="dxa"/>
-            <w:right w:w="108" w:type="dxa"/>
-          </w:tblCellMar>
         </w:tblPrEx>
         <w:tc>
           <w:tcPr>
@@ -19064,6 +19064,12 @@
             <w:insideH w:val="single" w:color="auto" w:sz="4" w:space="0"/>
             <w:insideV w:val="single" w:color="auto" w:sz="4" w:space="0"/>
           </w:tblBorders>
+          <w:tblCellMar>
+            <w:top w:w="0" w:type="dxa"/>
+            <w:left w:w="108" w:type="dxa"/>
+            <w:bottom w:w="0" w:type="dxa"/>
+            <w:right w:w="108" w:type="dxa"/>
+          </w:tblCellMar>
         </w:tblPrEx>
         <w:tc>
           <w:tcPr>
@@ -22033,6 +22039,12 @@
             <w:insideH w:val="single" w:color="auto" w:sz="4" w:space="0"/>
             <w:insideV w:val="single" w:color="auto" w:sz="4" w:space="0"/>
           </w:tblBorders>
+          <w:tblCellMar>
+            <w:top w:w="0" w:type="dxa"/>
+            <w:left w:w="108" w:type="dxa"/>
+            <w:bottom w:w="0" w:type="dxa"/>
+            <w:right w:w="108" w:type="dxa"/>
+          </w:tblCellMar>
         </w:tblPrEx>
         <w:tc>
           <w:tcPr>
@@ -22360,6 +22372,12 @@
             <w:insideH w:val="single" w:color="auto" w:sz="4" w:space="0"/>
             <w:insideV w:val="single" w:color="auto" w:sz="4" w:space="0"/>
           </w:tblBorders>
+          <w:tblCellMar>
+            <w:top w:w="0" w:type="dxa"/>
+            <w:left w:w="108" w:type="dxa"/>
+            <w:bottom w:w="0" w:type="dxa"/>
+            <w:right w:w="108" w:type="dxa"/>
+          </w:tblCellMar>
         </w:tblPrEx>
         <w:tc>
           <w:tcPr>
@@ -29044,12 +29062,6 @@
             <w:insideH w:val="single" w:color="auto" w:sz="4" w:space="0"/>
             <w:insideV w:val="single" w:color="auto" w:sz="4" w:space="0"/>
           </w:tblBorders>
-          <w:tblCellMar>
-            <w:top w:w="0" w:type="dxa"/>
-            <w:left w:w="108" w:type="dxa"/>
-            <w:bottom w:w="0" w:type="dxa"/>
-            <w:right w:w="108" w:type="dxa"/>
-          </w:tblCellMar>
         </w:tblPrEx>
         <w:trPr>
           <w:trHeight w:val="90" w:hRule="atLeast"/>
@@ -32845,7 +32857,6 @@
                 </w14:textFill>
               </w:rPr>
             </w:pPr>
-            <w:bookmarkStart w:id="0" w:name="_GoBack" w:colFirst="0" w:colLast="0"/>
             <w:r>
               <w:rPr>
                 <w:rFonts w:hint="eastAsia" w:cs="华文中宋"/>
@@ -32953,139 +32964,6 @@
                 <w:lang w:val="en-US" w:eastAsia="zh-CN"/>
               </w:rPr>
               <w:t>位置</w:t>
-            </w:r>
-          </w:p>
-        </w:tc>
-      </w:tr>
-      <w:bookmarkEnd w:id="0"/>
-      <w:tr>
-        <w:tblPrEx>
-          <w:tblBorders>
-            <w:top w:val="single" w:color="auto" w:sz="4" w:space="0"/>
-            <w:left w:val="single" w:color="auto" w:sz="4" w:space="0"/>
-            <w:bottom w:val="single" w:color="auto" w:sz="4" w:space="0"/>
-            <w:right w:val="single" w:color="auto" w:sz="4" w:space="0"/>
-            <w:insideH w:val="single" w:color="auto" w:sz="4" w:space="0"/>
-            <w:insideV w:val="single" w:color="auto" w:sz="4" w:space="0"/>
-          </w:tblBorders>
-          <w:tblCellMar>
-            <w:top w:w="0" w:type="dxa"/>
-            <w:left w:w="108" w:type="dxa"/>
-            <w:bottom w:w="0" w:type="dxa"/>
-            <w:right w:w="108" w:type="dxa"/>
-          </w:tblCellMar>
-        </w:tblPrEx>
-        <w:tc>
-          <w:tcPr>
-            <w:tcW w:w="0" w:type="auto"/>
-            <w:vMerge w:val="continue"/>
-            <w:tcBorders/>
-            <w:vAlign w:val="center"/>
-          </w:tcPr>
-          <w:p>
-            <w:pPr>
-              <w:pStyle w:val="13"/>
-              <w:bidi w:val="0"/>
-              <w:jc w:val="both"/>
-              <w:rPr>
-                <w:rFonts w:hint="eastAsia" w:cs="华文中宋"/>
-                <w:b/>
-                <w:bCs/>
-                <w:color w:val="ED7D31" w:themeColor="accent2"/>
-                <w:kern w:val="2"/>
-                <w:sz w:val="21"/>
-                <w:szCs w:val="21"/>
-                <w:vertAlign w:val="baseline"/>
-                <w:lang w:val="en-US" w:eastAsia="zh-CN" w:bidi="ar-SA"/>
-                <w14:textFill>
-                  <w14:solidFill>
-                    <w14:schemeClr w14:val="accent2"/>
-                  </w14:solidFill>
-                </w14:textFill>
-              </w:rPr>
-            </w:pPr>
-          </w:p>
-        </w:tc>
-        <w:tc>
-          <w:tcPr>
-            <w:tcW w:w="0" w:type="auto"/>
-            <w:vAlign w:val="center"/>
-          </w:tcPr>
-          <w:p>
-            <w:pPr>
-              <w:pStyle w:val="13"/>
-              <w:bidi w:val="0"/>
-              <w:jc w:val="both"/>
-              <w:rPr>
-                <w:rFonts w:hint="default" w:cs="华文中宋"/>
-                <w:b/>
-                <w:bCs/>
-                <w:color w:val="ED7D31" w:themeColor="accent2"/>
-                <w:kern w:val="2"/>
-                <w:sz w:val="21"/>
-                <w:szCs w:val="21"/>
-                <w:lang w:val="en-US" w:eastAsia="zh-CN" w:bidi="ar-SA"/>
-                <w14:textFill>
-                  <w14:solidFill>
-                    <w14:schemeClr w14:val="accent2"/>
-                  </w14:solidFill>
-                </w14:textFill>
-              </w:rPr>
-            </w:pPr>
-            <w:r>
-              <w:rPr>
-                <w:rFonts w:hint="eastAsia" w:cs="华文中宋"/>
-                <w:b/>
-                <w:bCs/>
-                <w:color w:val="ED7D31" w:themeColor="accent2"/>
-                <w:kern w:val="2"/>
-                <w:sz w:val="21"/>
-                <w:szCs w:val="21"/>
-                <w:lang w:val="en-US" w:eastAsia="zh-CN" w:bidi="ar-SA"/>
-                <w14:textFill>
-                  <w14:solidFill>
-                    <w14:schemeClr w14:val="accent2"/>
-                  </w14:solidFill>
-                </w14:textFill>
-              </w:rPr>
-              <w:t>float64[]</w:t>
-            </w:r>
-            <w:r>
-              <w:rPr>
-                <w:rFonts w:hint="eastAsia" w:cs="华文中宋"/>
-                <w:b/>
-                <w:bCs/>
-                <w:color w:val="FF0000"/>
-                <w:kern w:val="2"/>
-                <w:sz w:val="21"/>
-                <w:szCs w:val="21"/>
-                <w:lang w:val="en-US" w:eastAsia="zh-CN" w:bidi="ar-SA"/>
-              </w:rPr>
-              <w:t xml:space="preserve"> velocities</w:t>
-            </w:r>
-          </w:p>
-        </w:tc>
-        <w:tc>
-          <w:tcPr>
-            <w:tcW w:w="0" w:type="auto"/>
-            <w:vAlign w:val="center"/>
-          </w:tcPr>
-          <w:p>
-            <w:pPr>
-              <w:jc w:val="both"/>
-              <w:rPr>
-                <w:rStyle w:val="14"/>
-                <w:rFonts w:hint="eastAsia"/>
-                <w:lang w:val="en-US" w:eastAsia="zh-CN"/>
-              </w:rPr>
-            </w:pPr>
-            <w:r>
-              <w:rPr>
-                <w:rStyle w:val="14"/>
-                <w:rFonts w:hint="eastAsia"/>
-                <w:lang w:val="en-US" w:eastAsia="zh-CN"/>
-              </w:rPr>
-              <w:t>速度</w:t>
             </w:r>
           </w:p>
         </w:tc>
@@ -33111,7 +32989,6 @@
           <w:tcPr>
             <w:tcW w:w="0" w:type="auto"/>
             <w:vMerge w:val="continue"/>
-            <w:tcBorders/>
             <w:vAlign w:val="center"/>
           </w:tcPr>
           <w:p>
@@ -33193,7 +33070,7 @@
                 <w:szCs w:val="21"/>
                 <w:lang w:val="en-US" w:eastAsia="zh-CN" w:bidi="ar-SA"/>
               </w:rPr>
-              <w:t xml:space="preserve"> accelerations</w:t>
+              <w:t xml:space="preserve"> velocities</w:t>
             </w:r>
           </w:p>
         </w:tc>
@@ -33217,7 +33094,7 @@
                 <w:rFonts w:hint="eastAsia"/>
                 <w:lang w:val="en-US" w:eastAsia="zh-CN"/>
               </w:rPr>
-              <w:t>加速度</w:t>
+              <w:t>速度</w:t>
             </w:r>
           </w:p>
         </w:tc>
@@ -33243,7 +33120,137 @@
           <w:tcPr>
             <w:tcW w:w="0" w:type="auto"/>
             <w:vMerge w:val="continue"/>
-            <w:tcBorders/>
+            <w:vAlign w:val="center"/>
+          </w:tcPr>
+          <w:p>
+            <w:pPr>
+              <w:pStyle w:val="13"/>
+              <w:bidi w:val="0"/>
+              <w:jc w:val="both"/>
+              <w:rPr>
+                <w:rFonts w:hint="eastAsia" w:cs="华文中宋"/>
+                <w:b/>
+                <w:bCs/>
+                <w:color w:val="ED7D31" w:themeColor="accent2"/>
+                <w:kern w:val="2"/>
+                <w:sz w:val="21"/>
+                <w:szCs w:val="21"/>
+                <w:vertAlign w:val="baseline"/>
+                <w:lang w:val="en-US" w:eastAsia="zh-CN" w:bidi="ar-SA"/>
+                <w14:textFill>
+                  <w14:solidFill>
+                    <w14:schemeClr w14:val="accent2"/>
+                  </w14:solidFill>
+                </w14:textFill>
+              </w:rPr>
+            </w:pPr>
+          </w:p>
+        </w:tc>
+        <w:tc>
+          <w:tcPr>
+            <w:tcW w:w="0" w:type="auto"/>
+            <w:vAlign w:val="center"/>
+          </w:tcPr>
+          <w:p>
+            <w:pPr>
+              <w:pStyle w:val="13"/>
+              <w:bidi w:val="0"/>
+              <w:jc w:val="both"/>
+              <w:rPr>
+                <w:rFonts w:hint="default" w:cs="华文中宋"/>
+                <w:b/>
+                <w:bCs/>
+                <w:color w:val="ED7D31" w:themeColor="accent2"/>
+                <w:kern w:val="2"/>
+                <w:sz w:val="21"/>
+                <w:szCs w:val="21"/>
+                <w:lang w:val="en-US" w:eastAsia="zh-CN" w:bidi="ar-SA"/>
+                <w14:textFill>
+                  <w14:solidFill>
+                    <w14:schemeClr w14:val="accent2"/>
+                  </w14:solidFill>
+                </w14:textFill>
+              </w:rPr>
+            </w:pPr>
+            <w:r>
+              <w:rPr>
+                <w:rFonts w:hint="eastAsia" w:cs="华文中宋"/>
+                <w:b/>
+                <w:bCs/>
+                <w:color w:val="ED7D31" w:themeColor="accent2"/>
+                <w:kern w:val="2"/>
+                <w:sz w:val="21"/>
+                <w:szCs w:val="21"/>
+                <w:lang w:val="en-US" w:eastAsia="zh-CN" w:bidi="ar-SA"/>
+                <w14:textFill>
+                  <w14:solidFill>
+                    <w14:schemeClr w14:val="accent2"/>
+                  </w14:solidFill>
+                </w14:textFill>
+              </w:rPr>
+              <w:t>float64[]</w:t>
+            </w:r>
+            <w:r>
+              <w:rPr>
+                <w:rFonts w:hint="eastAsia" w:cs="华文中宋"/>
+                <w:b/>
+                <w:bCs/>
+                <w:color w:val="FF0000"/>
+                <w:kern w:val="2"/>
+                <w:sz w:val="21"/>
+                <w:szCs w:val="21"/>
+                <w:lang w:val="en-US" w:eastAsia="zh-CN" w:bidi="ar-SA"/>
+              </w:rPr>
+              <w:t xml:space="preserve"> accelerations</w:t>
+            </w:r>
+          </w:p>
+        </w:tc>
+        <w:tc>
+          <w:tcPr>
+            <w:tcW w:w="0" w:type="auto"/>
+            <w:vAlign w:val="center"/>
+          </w:tcPr>
+          <w:p>
+            <w:pPr>
+              <w:jc w:val="both"/>
+              <w:rPr>
+                <w:rStyle w:val="14"/>
+                <w:rFonts w:hint="eastAsia"/>
+                <w:lang w:val="en-US" w:eastAsia="zh-CN"/>
+              </w:rPr>
+            </w:pPr>
+            <w:r>
+              <w:rPr>
+                <w:rStyle w:val="14"/>
+                <w:rFonts w:hint="eastAsia"/>
+                <w:lang w:val="en-US" w:eastAsia="zh-CN"/>
+              </w:rPr>
+              <w:t>加速度</w:t>
+            </w:r>
+          </w:p>
+        </w:tc>
+      </w:tr>
+      <w:tr>
+        <w:tblPrEx>
+          <w:tblBorders>
+            <w:top w:val="single" w:color="auto" w:sz="4" w:space="0"/>
+            <w:left w:val="single" w:color="auto" w:sz="4" w:space="0"/>
+            <w:bottom w:val="single" w:color="auto" w:sz="4" w:space="0"/>
+            <w:right w:val="single" w:color="auto" w:sz="4" w:space="0"/>
+            <w:insideH w:val="single" w:color="auto" w:sz="4" w:space="0"/>
+            <w:insideV w:val="single" w:color="auto" w:sz="4" w:space="0"/>
+          </w:tblBorders>
+          <w:tblCellMar>
+            <w:top w:w="0" w:type="dxa"/>
+            <w:left w:w="108" w:type="dxa"/>
+            <w:bottom w:w="0" w:type="dxa"/>
+            <w:right w:w="108" w:type="dxa"/>
+          </w:tblCellMar>
+        </w:tblPrEx>
+        <w:tc>
+          <w:tcPr>
+            <w:tcW w:w="0" w:type="auto"/>
+            <w:vMerge w:val="continue"/>
             <w:vAlign w:val="center"/>
           </w:tcPr>
           <w:p>
@@ -40175,7 +40182,7 @@
           <w:rFonts w:hint="eastAsia"/>
           <w:lang w:val="en-US" w:eastAsia="zh-CN"/>
         </w:rPr>
-        <w:t>noetic：</w:t>
+        <w:t>ros1：</w:t>
       </w:r>
     </w:p>
     <w:p>
@@ -40236,14 +40243,8 @@
           <w:lang w:val="en-US" w:eastAsia="zh-CN"/>
         </w:rPr>
       </w:pPr>
-    </w:p>
-    <w:p>
-      <w:pPr>
-        <w:rPr>
-          <w:rFonts w:hint="default"/>
-          <w:lang w:val="en-US" w:eastAsia="zh-CN"/>
-        </w:rPr>
-      </w:pPr>
+      <w:bookmarkStart w:id="0" w:name="_GoBack"/>
+      <w:bookmarkEnd w:id="0"/>
     </w:p>
     <w:tbl>
       <w:tblPr>
@@ -40455,6 +40456,12 @@
             <w:insideH w:val="single" w:color="auto" w:sz="4" w:space="0"/>
             <w:insideV w:val="single" w:color="auto" w:sz="4" w:space="0"/>
           </w:tblBorders>
+          <w:tblCellMar>
+            <w:top w:w="0" w:type="dxa"/>
+            <w:left w:w="108" w:type="dxa"/>
+            <w:bottom w:w="0" w:type="dxa"/>
+            <w:right w:w="108" w:type="dxa"/>
+          </w:tblCellMar>
         </w:tblPrEx>
         <w:tc>
           <w:tcPr>
@@ -43425,6 +43432,12 @@
             <w:insideH w:val="single" w:color="auto" w:sz="4" w:space="0"/>
             <w:insideV w:val="single" w:color="auto" w:sz="4" w:space="0"/>
           </w:tblBorders>
+          <w:tblCellMar>
+            <w:top w:w="0" w:type="dxa"/>
+            <w:left w:w="108" w:type="dxa"/>
+            <w:bottom w:w="0" w:type="dxa"/>
+            <w:right w:w="108" w:type="dxa"/>
+          </w:tblCellMar>
         </w:tblPrEx>
         <w:tc>
           <w:tcPr>
@@ -45006,6 +45019,12 @@
             <w:insideH w:val="single" w:color="auto" w:sz="4" w:space="0"/>
             <w:insideV w:val="single" w:color="auto" w:sz="4" w:space="0"/>
           </w:tblBorders>
+          <w:tblCellMar>
+            <w:top w:w="0" w:type="dxa"/>
+            <w:left w:w="108" w:type="dxa"/>
+            <w:bottom w:w="0" w:type="dxa"/>
+            <w:right w:w="108" w:type="dxa"/>
+          </w:tblCellMar>
         </w:tblPrEx>
         <w:tc>
           <w:tcPr>
@@ -48176,6 +48195,12 @@
             <w:insideH w:val="single" w:color="auto" w:sz="4" w:space="0"/>
             <w:insideV w:val="single" w:color="auto" w:sz="4" w:space="0"/>
           </w:tblBorders>
+          <w:tblCellMar>
+            <w:top w:w="0" w:type="dxa"/>
+            <w:left w:w="108" w:type="dxa"/>
+            <w:bottom w:w="0" w:type="dxa"/>
+            <w:right w:w="108" w:type="dxa"/>
+          </w:tblCellMar>
         </w:tblPrEx>
         <w:tc>
           <w:tcPr>
@@ -50280,6 +50305,12 @@
             <w:insideH w:val="single" w:color="auto" w:sz="4" w:space="0"/>
             <w:insideV w:val="single" w:color="auto" w:sz="4" w:space="0"/>
           </w:tblBorders>
+          <w:tblCellMar>
+            <w:top w:w="0" w:type="dxa"/>
+            <w:left w:w="108" w:type="dxa"/>
+            <w:bottom w:w="0" w:type="dxa"/>
+            <w:right w:w="108" w:type="dxa"/>
+          </w:tblCellMar>
         </w:tblPrEx>
         <w:tc>
           <w:tcPr>

</xml_diff>